<commit_message>
Update report: replace all image placeholders with generated diagrams and UI mockups
Agent-Logs-Url: https://github.com/Chotan29/restaurent.repo/sessions/2275b4ed-4472-480d-b3d5-f454064a4373

Co-authored-by: Chotan29 <48766771+Chotan29@users.noreply.github.com>
</commit_message>
<xml_diff>
--- a/Laravel_WebDev_Project_Report.docx
+++ b/Laravel_WebDev_Project_Report.docx
@@ -44,7 +44,7 @@
     </w:p>
     <w:p>
       <w:pPr>
-        <w:spacing w:before="160" w:after="80"/>
+        <w:spacing w:before="120" w:after="80"/>
         <w:jc w:val="center"/>
       </w:pPr>
       <w:r>
@@ -56,43 +56,49 @@
         </w:rPr>
       </w:r>
     </w:p>
-    <w:tbl>
-      <w:tblPr>
-        <w:tblStyle w:val="TableGrid"/>
-        <w:tblW w:type="auto" w:w="0"/>
-        <w:tblLook w:firstColumn="1" w:firstRow="1" w:lastColumn="0" w:lastRow="0" w:noHBand="0" w:noVBand="1" w:val="04A0"/>
-      </w:tblPr>
-      <w:tblGrid>
-        <w:gridCol w:w="9072"/>
-      </w:tblGrid>
-      <w:tr>
-        <w:tc>
-          <w:tcPr>
-            <w:tcW w:type="dxa" w:w="9072"/>
-            <w:shd w:val="clear" w:color="auto" w:fill="E8E8E8"/>
-          </w:tcPr>
-          <w:p>
-            <w:pPr>
-              <w:spacing w:before="600" w:after="600"/>
-              <w:jc w:val="center"/>
-            </w:pPr>
-            <w:r>
-              <w:rPr>
-                <w:rFonts w:ascii="Calibri" w:hAnsi="Calibri"/>
-                <w:b w:val="0"/>
-                <w:i/>
-                <w:color w:val="595959"/>
-                <w:sz w:val="22"/>
-              </w:rPr>
-              <w:t>[ Screenshot: University / Institute Crest ]</w:t>
-            </w:r>
-          </w:p>
-        </w:tc>
-      </w:tr>
-    </w:tbl>
     <w:p>
       <w:pPr>
-        <w:spacing w:after="160"/>
+        <w:spacing w:before="80" w:after="40"/>
+        <w:jc w:val="center"/>
+      </w:pPr>
+      <w:r>
+        <w:drawing>
+          <wp:inline xmlns:a="http://schemas.openxmlformats.org/drawingml/2006/main" xmlns:pic="http://schemas.openxmlformats.org/drawingml/2006/picture">
+            <wp:extent cx="2286000" cy="2271034"/>
+            <wp:docPr id="1" name="Picture 1"/>
+            <wp:cNvGraphicFramePr>
+              <a:graphicFrameLocks noChangeAspect="1"/>
+            </wp:cNvGraphicFramePr>
+            <a:graphic>
+              <a:graphicData uri="http://schemas.openxmlformats.org/drawingml/2006/picture">
+                <pic:pic>
+                  <pic:nvPicPr>
+                    <pic:cNvPr id="0" name="crest.png"/>
+                    <pic:cNvPicPr/>
+                  </pic:nvPicPr>
+                  <pic:blipFill>
+                    <a:blip r:embed="rId9"/>
+                    <a:stretch>
+                      <a:fillRect/>
+                    </a:stretch>
+                  </pic:blipFill>
+                  <pic:spPr>
+                    <a:xfrm>
+                      <a:off x="0" y="0"/>
+                      <a:ext cx="2286000" cy="2271034"/>
+                    </a:xfrm>
+                    <a:prstGeom prst="rect"/>
+                  </pic:spPr>
+                </pic:pic>
+              </a:graphicData>
+            </a:graphic>
+          </wp:inline>
+        </w:drawing>
+      </w:r>
+    </w:p>
+    <w:p>
+      <w:pPr>
+        <w:spacing w:after="200"/>
         <w:jc w:val="center"/>
       </w:pPr>
       <w:r>
@@ -103,7 +109,7 @@
           <w:color w:val="7F7F7F"/>
           <w:sz w:val="18"/>
         </w:rPr>
-        <w:t>Figure: University / Institute Crest</w:t>
+        <w:t>Figure: Comilla Polytechnic Institute Crest</w:t>
       </w:r>
     </w:p>
     <w:p>
@@ -1252,7 +1258,7 @@
                 <w:i w:val="0"/>
                 <w:sz w:val="20"/>
               </w:rPr>
-              <w:t xml:space="preserve">  3.3 Technology Stack Summary Table</w:t>
+              <w:t xml:space="preserve">  3.3 Tech Stack Table</w:t>
             </w:r>
           </w:p>
         </w:tc>
@@ -1400,7 +1406,7 @@
                 <w:i w:val="0"/>
                 <w:sz w:val="20"/>
               </w:rPr>
-              <w:t xml:space="preserve">  4.3 Hardware &amp; Software Requirements</w:t>
+              <w:t xml:space="preserve">  4.3 HW &amp; SW Requirements</w:t>
             </w:r>
           </w:p>
         </w:tc>
@@ -1530,7 +1536,7 @@
                 <w:i w:val="0"/>
                 <w:sz w:val="20"/>
               </w:rPr>
-              <w:t>13</w:t>
+              <w:t>14</w:t>
             </w:r>
           </w:p>
         </w:tc>
@@ -1567,7 +1573,7 @@
                 <w:i w:val="0"/>
                 <w:sz w:val="20"/>
               </w:rPr>
-              <w:t>14</w:t>
+              <w:t>15</w:t>
             </w:r>
           </w:p>
         </w:tc>
@@ -1604,7 +1610,7 @@
                 <w:i w:val="0"/>
                 <w:sz w:val="20"/>
               </w:rPr>
-              <w:t>14</w:t>
+              <w:t>16</w:t>
             </w:r>
           </w:p>
         </w:tc>
@@ -1641,7 +1647,7 @@
                 <w:i w:val="0"/>
                 <w:sz w:val="20"/>
               </w:rPr>
-              <w:t>15</w:t>
+              <w:t>17</w:t>
             </w:r>
           </w:p>
         </w:tc>
@@ -1678,7 +1684,7 @@
                 <w:i w:val="0"/>
                 <w:sz w:val="20"/>
               </w:rPr>
-              <w:t>15</w:t>
+              <w:t>17</w:t>
             </w:r>
           </w:p>
         </w:tc>
@@ -1715,7 +1721,7 @@
                 <w:i w:val="0"/>
                 <w:sz w:val="20"/>
               </w:rPr>
-              <w:t>20</w:t>
+              <w:t>22</w:t>
             </w:r>
           </w:p>
         </w:tc>
@@ -1752,7 +1758,7 @@
                 <w:i w:val="0"/>
                 <w:sz w:val="20"/>
               </w:rPr>
-              <w:t>20</w:t>
+              <w:t>22</w:t>
             </w:r>
           </w:p>
         </w:tc>
@@ -1789,7 +1795,7 @@
                 <w:i w:val="0"/>
                 <w:sz w:val="20"/>
               </w:rPr>
-              <w:t>20</w:t>
+              <w:t>22</w:t>
             </w:r>
           </w:p>
         </w:tc>
@@ -1807,7 +1813,7 @@
                 <w:i w:val="0"/>
                 <w:sz w:val="20"/>
               </w:rPr>
-              <w:t xml:space="preserve">  7.3 Controller – OrderController</w:t>
+              <w:t xml:space="preserve">  7.3 OrderController</w:t>
             </w:r>
           </w:p>
         </w:tc>
@@ -1826,7 +1832,7 @@
                 <w:i w:val="0"/>
                 <w:sz w:val="20"/>
               </w:rPr>
-              <w:t>21</w:t>
+              <w:t>23</w:t>
             </w:r>
           </w:p>
         </w:tc>
@@ -1863,7 +1869,7 @@
                 <w:i w:val="0"/>
                 <w:sz w:val="20"/>
               </w:rPr>
-              <w:t>22</w:t>
+              <w:t>24</w:t>
             </w:r>
           </w:p>
         </w:tc>
@@ -1900,7 +1906,7 @@
                 <w:i w:val="0"/>
                 <w:sz w:val="20"/>
               </w:rPr>
-              <w:t>23</w:t>
+              <w:t>25</w:t>
             </w:r>
           </w:p>
         </w:tc>
@@ -1937,7 +1943,7 @@
                 <w:i w:val="0"/>
                 <w:sz w:val="20"/>
               </w:rPr>
-              <w:t>26</w:t>
+              <w:t>28</w:t>
             </w:r>
           </w:p>
         </w:tc>
@@ -1974,7 +1980,7 @@
                 <w:i w:val="0"/>
                 <w:sz w:val="20"/>
               </w:rPr>
-              <w:t>26</w:t>
+              <w:t>28</w:t>
             </w:r>
           </w:p>
         </w:tc>
@@ -2011,7 +2017,7 @@
                 <w:i w:val="0"/>
                 <w:sz w:val="20"/>
               </w:rPr>
-              <w:t>27</w:t>
+              <w:t>29</w:t>
             </w:r>
           </w:p>
         </w:tc>
@@ -2048,7 +2054,7 @@
                 <w:i w:val="0"/>
                 <w:sz w:val="20"/>
               </w:rPr>
-              <w:t>28</w:t>
+              <w:t>30</w:t>
             </w:r>
           </w:p>
         </w:tc>
@@ -2085,7 +2091,7 @@
                 <w:i w:val="0"/>
                 <w:sz w:val="20"/>
               </w:rPr>
-              <w:t>29</w:t>
+              <w:t>31</w:t>
             </w:r>
           </w:p>
         </w:tc>
@@ -2122,7 +2128,7 @@
                 <w:i w:val="0"/>
                 <w:sz w:val="20"/>
               </w:rPr>
-              <w:t>30</w:t>
+              <w:t>32</w:t>
             </w:r>
           </w:p>
         </w:tc>
@@ -2542,7 +2548,7 @@
                 <w:i w:val="0"/>
                 <w:sz w:val="20"/>
               </w:rPr>
-              <w:t>15</w:t>
+              <w:t>17</w:t>
             </w:r>
           </w:p>
         </w:tc>
@@ -2592,7 +2598,7 @@
                 <w:i w:val="0"/>
                 <w:sz w:val="20"/>
               </w:rPr>
-              <w:t>15</w:t>
+              <w:t>17</w:t>
             </w:r>
           </w:p>
         </w:tc>
@@ -2642,7 +2648,7 @@
                 <w:i w:val="0"/>
                 <w:sz w:val="20"/>
               </w:rPr>
-              <w:t>16</w:t>
+              <w:t>18</w:t>
             </w:r>
           </w:p>
         </w:tc>
@@ -2692,7 +2698,7 @@
                 <w:i w:val="0"/>
                 <w:sz w:val="20"/>
               </w:rPr>
-              <w:t>17</w:t>
+              <w:t>19</w:t>
             </w:r>
           </w:p>
         </w:tc>
@@ -2742,7 +2748,7 @@
                 <w:i w:val="0"/>
                 <w:sz w:val="20"/>
               </w:rPr>
-              <w:t>17</w:t>
+              <w:t>19</w:t>
             </w:r>
           </w:p>
         </w:tc>
@@ -2792,7 +2798,7 @@
                 <w:i w:val="0"/>
                 <w:sz w:val="20"/>
               </w:rPr>
-              <w:t>18</w:t>
+              <w:t>20</w:t>
             </w:r>
           </w:p>
         </w:tc>
@@ -2842,7 +2848,7 @@
                 <w:i w:val="0"/>
                 <w:sz w:val="20"/>
               </w:rPr>
-              <w:t>19</w:t>
+              <w:t>21</w:t>
             </w:r>
           </w:p>
         </w:tc>
@@ -2892,7 +2898,7 @@
                 <w:i w:val="0"/>
                 <w:sz w:val="20"/>
               </w:rPr>
-              <w:t>26</w:t>
+              <w:t>28</w:t>
             </w:r>
           </w:p>
         </w:tc>
@@ -2942,7 +2948,7 @@
                 <w:i w:val="0"/>
                 <w:sz w:val="20"/>
               </w:rPr>
-              <w:t>27</w:t>
+              <w:t>29</w:t>
             </w:r>
           </w:p>
         </w:tc>
@@ -3047,7 +3053,7 @@
                 <w:i w:val="0"/>
                 <w:sz w:val="20"/>
               </w:rPr>
-              <w:t>Figure 5.1</w:t>
+              <w:t>Figure 1</w:t>
             </w:r>
           </w:p>
         </w:tc>
@@ -3063,7 +3069,7 @@
                 <w:i w:val="0"/>
                 <w:sz w:val="20"/>
               </w:rPr>
-              <w:t>System Architecture Diagram</w:t>
+              <w:t>Comilla Polytechnic Institute Crest</w:t>
             </w:r>
           </w:p>
         </w:tc>
@@ -3079,7 +3085,7 @@
                 <w:i w:val="0"/>
                 <w:sz w:val="20"/>
               </w:rPr>
-              <w:t>13</w:t>
+              <w:t>Cover</w:t>
             </w:r>
           </w:p>
         </w:tc>
@@ -3097,7 +3103,7 @@
                 <w:i w:val="0"/>
                 <w:sz w:val="20"/>
               </w:rPr>
-              <w:t>Figure 5.2</w:t>
+              <w:t>Figure 5.1</w:t>
             </w:r>
           </w:p>
         </w:tc>
@@ -3113,7 +3119,7 @@
                 <w:i w:val="0"/>
                 <w:sz w:val="20"/>
               </w:rPr>
-              <w:t>Use Case Diagram</w:t>
+              <w:t>System Architecture Diagram</w:t>
             </w:r>
           </w:p>
         </w:tc>
@@ -3147,7 +3153,7 @@
                 <w:i w:val="0"/>
                 <w:sz w:val="20"/>
               </w:rPr>
-              <w:t>Figure 5.3</w:t>
+              <w:t>Figure 5.2</w:t>
             </w:r>
           </w:p>
         </w:tc>
@@ -3163,7 +3169,7 @@
                 <w:i w:val="0"/>
                 <w:sz w:val="20"/>
               </w:rPr>
-              <w:t>Entity-Relationship (ER) Diagram</w:t>
+              <w:t>Use Case Diagram</w:t>
             </w:r>
           </w:p>
         </w:tc>
@@ -3197,7 +3203,7 @@
                 <w:i w:val="0"/>
                 <w:sz w:val="20"/>
               </w:rPr>
-              <w:t>Figure 5.4</w:t>
+              <w:t>Figure 5.3</w:t>
             </w:r>
           </w:p>
         </w:tc>
@@ -3213,7 +3219,7 @@
                 <w:i w:val="0"/>
                 <w:sz w:val="20"/>
               </w:rPr>
-              <w:t>Data Flow Diagram – Level 0</w:t>
+              <w:t>Entity-Relationship (ER) Diagram</w:t>
             </w:r>
           </w:p>
         </w:tc>
@@ -3229,7 +3235,7 @@
                 <w:i w:val="0"/>
                 <w:sz w:val="20"/>
               </w:rPr>
-              <w:t>14</w:t>
+              <w:t>15</w:t>
             </w:r>
           </w:p>
         </w:tc>
@@ -3247,7 +3253,7 @@
                 <w:i w:val="0"/>
                 <w:sz w:val="20"/>
               </w:rPr>
-              <w:t>Figure 8.1</w:t>
+              <w:t>Figure 5.4</w:t>
             </w:r>
           </w:p>
         </w:tc>
@@ -3263,7 +3269,7 @@
                 <w:i w:val="0"/>
                 <w:sz w:val="20"/>
               </w:rPr>
-              <w:t>Home / Landing Page</w:t>
+              <w:t>Data Flow Diagram – Level 0</w:t>
             </w:r>
           </w:p>
         </w:tc>
@@ -3279,7 +3285,7 @@
                 <w:i w:val="0"/>
                 <w:sz w:val="20"/>
               </w:rPr>
-              <w:t>23</w:t>
+              <w:t>16</w:t>
             </w:r>
           </w:p>
         </w:tc>
@@ -3297,7 +3303,7 @@
                 <w:i w:val="0"/>
                 <w:sz w:val="20"/>
               </w:rPr>
-              <w:t>Figure 8.2</w:t>
+              <w:t>Figure 8.1</w:t>
             </w:r>
           </w:p>
         </w:tc>
@@ -3313,7 +3319,7 @@
                 <w:i w:val="0"/>
                 <w:sz w:val="20"/>
               </w:rPr>
-              <w:t>User Registration Page</w:t>
+              <w:t>Home / Landing Page</w:t>
             </w:r>
           </w:p>
         </w:tc>
@@ -3329,7 +3335,7 @@
                 <w:i w:val="0"/>
                 <w:sz w:val="20"/>
               </w:rPr>
-              <w:t>23</w:t>
+              <w:t>25</w:t>
             </w:r>
           </w:p>
         </w:tc>
@@ -3347,7 +3353,7 @@
                 <w:i w:val="0"/>
                 <w:sz w:val="20"/>
               </w:rPr>
-              <w:t>Figure 8.3</w:t>
+              <w:t>Figure 8.2</w:t>
             </w:r>
           </w:p>
         </w:tc>
@@ -3363,7 +3369,7 @@
                 <w:i w:val="0"/>
                 <w:sz w:val="20"/>
               </w:rPr>
-              <w:t>Login Page</w:t>
+              <w:t>User Registration Page</w:t>
             </w:r>
           </w:p>
         </w:tc>
@@ -3379,7 +3385,7 @@
                 <w:i w:val="0"/>
                 <w:sz w:val="20"/>
               </w:rPr>
-              <w:t>24</w:t>
+              <w:t>25</w:t>
             </w:r>
           </w:p>
         </w:tc>
@@ -3397,7 +3403,7 @@
                 <w:i w:val="0"/>
                 <w:sz w:val="20"/>
               </w:rPr>
-              <w:t>Figure 8.4</w:t>
+              <w:t>Figure 8.3</w:t>
             </w:r>
           </w:p>
         </w:tc>
@@ -3413,7 +3419,7 @@
                 <w:i w:val="0"/>
                 <w:sz w:val="20"/>
               </w:rPr>
-              <w:t>Menu Listing Page</w:t>
+              <w:t>Login Page</w:t>
             </w:r>
           </w:p>
         </w:tc>
@@ -3429,7 +3435,7 @@
                 <w:i w:val="0"/>
                 <w:sz w:val="20"/>
               </w:rPr>
-              <w:t>24</w:t>
+              <w:t>26</w:t>
             </w:r>
           </w:p>
         </w:tc>
@@ -3447,7 +3453,7 @@
                 <w:i w:val="0"/>
                 <w:sz w:val="20"/>
               </w:rPr>
-              <w:t>Figure 8.5</w:t>
+              <w:t>Figure 8.4</w:t>
             </w:r>
           </w:p>
         </w:tc>
@@ -3463,7 +3469,7 @@
                 <w:i w:val="0"/>
                 <w:sz w:val="20"/>
               </w:rPr>
-              <w:t>Shopping Cart Page</w:t>
+              <w:t>Menu Listing Page</w:t>
             </w:r>
           </w:p>
         </w:tc>
@@ -3479,7 +3485,7 @@
                 <w:i w:val="0"/>
                 <w:sz w:val="20"/>
               </w:rPr>
-              <w:t>25</w:t>
+              <w:t>26</w:t>
             </w:r>
           </w:p>
         </w:tc>
@@ -3497,6 +3503,56 @@
                 <w:i w:val="0"/>
                 <w:sz w:val="20"/>
               </w:rPr>
+              <w:t>Figure 8.5</w:t>
+            </w:r>
+          </w:p>
+        </w:tc>
+        <w:tc>
+          <w:tcPr>
+            <w:tcW w:type="dxa" w:w="3024"/>
+          </w:tcPr>
+          <w:p>
+            <w:r>
+              <w:rPr>
+                <w:rFonts w:ascii="Calibri" w:hAnsi="Calibri"/>
+                <w:b w:val="0"/>
+                <w:i w:val="0"/>
+                <w:sz w:val="20"/>
+              </w:rPr>
+              <w:t>Shopping Cart Page</w:t>
+            </w:r>
+          </w:p>
+        </w:tc>
+        <w:tc>
+          <w:tcPr>
+            <w:tcW w:type="dxa" w:w="3024"/>
+          </w:tcPr>
+          <w:p>
+            <w:r>
+              <w:rPr>
+                <w:rFonts w:ascii="Calibri" w:hAnsi="Calibri"/>
+                <w:b w:val="0"/>
+                <w:i w:val="0"/>
+                <w:sz w:val="20"/>
+              </w:rPr>
+              <w:t>27</w:t>
+            </w:r>
+          </w:p>
+        </w:tc>
+      </w:tr>
+      <w:tr>
+        <w:tc>
+          <w:tcPr>
+            <w:tcW w:type="dxa" w:w="3024"/>
+          </w:tcPr>
+          <w:p>
+            <w:r>
+              <w:rPr>
+                <w:rFonts w:ascii="Calibri" w:hAnsi="Calibri"/>
+                <w:b w:val="0"/>
+                <w:i w:val="0"/>
+                <w:sz w:val="20"/>
+              </w:rPr>
               <w:t>Figure 8.6</w:t>
             </w:r>
           </w:p>
@@ -3529,7 +3585,7 @@
                 <w:i w:val="0"/>
                 <w:sz w:val="20"/>
               </w:rPr>
-              <w:t>25</w:t>
+              <w:t>27</w:t>
             </w:r>
           </w:p>
         </w:tc>
@@ -3621,7 +3677,7 @@
           <w:i w:val="0"/>
           <w:sz w:val="22"/>
         </w:rPr>
-        <w:t>Many restaurants in Bangladesh still rely on manual, paper-based processes for order taking, stock management, and record keeping. These lead to:</w:t>
+        <w:t>Many restaurants in Bangladesh still rely on manual, paper-based processes. These lead to:</w:t>
       </w:r>
     </w:p>
     <w:p>
@@ -3946,7 +4002,7 @@
           <w:i w:val="0"/>
           <w:sz w:val="22"/>
         </w:rPr>
-        <w:t>Modern web apps follow REST principles, providing APIs that decouple the frontend from the backend and support mobile clients consuming the same services.</w:t>
+        <w:t>Modern web apps follow REST principles, providing APIs that decouple the frontend from the backend and support mobile clients.</w:t>
       </w:r>
     </w:p>
     <w:p>
@@ -4412,7 +4468,7 @@
           <w:i w:val="0"/>
           <w:sz w:val="22"/>
         </w:rPr>
-        <w:t>The proposed system improves upon related work with complete CRUD management, role-based access, table reservations, and sales reporting — all within one Laravel application.</w:t>
+        <w:t>The proposed system improves upon related work by delivering complete CRUD management, role-based access, table reservations, and sales reporting within a single Laravel application.</w:t>
       </w:r>
     </w:p>
     <w:p>
@@ -7312,43 +7368,49 @@
         <w:t>The application follows the classic three-tier web architecture: Presentation Tier (Blade views / Bootstrap), Application Tier (Laravel controllers &amp; business logic), and Data Tier (MySQL via Eloquent ORM).</w:t>
       </w:r>
     </w:p>
-    <w:tbl>
-      <w:tblPr>
-        <w:tblStyle w:val="TableGrid"/>
-        <w:tblW w:type="auto" w:w="0"/>
-        <w:tblLook w:firstColumn="1" w:firstRow="1" w:lastColumn="0" w:lastRow="0" w:noHBand="0" w:noVBand="1" w:val="04A0"/>
-      </w:tblPr>
-      <w:tblGrid>
-        <w:gridCol w:w="9072"/>
-      </w:tblGrid>
-      <w:tr>
-        <w:tc>
-          <w:tcPr>
-            <w:tcW w:type="dxa" w:w="9072"/>
-            <w:shd w:val="clear" w:color="auto" w:fill="E8E8E8"/>
-          </w:tcPr>
-          <w:p>
-            <w:pPr>
-              <w:spacing w:before="800" w:after="800"/>
-              <w:jc w:val="center"/>
-            </w:pPr>
-            <w:r>
-              <w:rPr>
-                <w:rFonts w:ascii="Calibri" w:hAnsi="Calibri"/>
-                <w:b w:val="0"/>
-                <w:i/>
-                <w:color w:val="595959"/>
-                <w:sz w:val="22"/>
-              </w:rPr>
-              <w:t>[ Screenshot: System Architecture Diagram – 3-Tier Web Application ]</w:t>
-            </w:r>
-          </w:p>
-        </w:tc>
-      </w:tr>
-    </w:tbl>
     <w:p>
       <w:pPr>
-        <w:spacing w:after="160"/>
+        <w:spacing w:before="80" w:after="40"/>
+        <w:jc w:val="center"/>
+      </w:pPr>
+      <w:r>
+        <w:drawing>
+          <wp:inline xmlns:a="http://schemas.openxmlformats.org/drawingml/2006/main" xmlns:pic="http://schemas.openxmlformats.org/drawingml/2006/picture">
+            <wp:extent cx="5486400" cy="2982540"/>
+            <wp:docPr id="2" name="Picture 2"/>
+            <wp:cNvGraphicFramePr>
+              <a:graphicFrameLocks noChangeAspect="1"/>
+            </wp:cNvGraphicFramePr>
+            <a:graphic>
+              <a:graphicData uri="http://schemas.openxmlformats.org/drawingml/2006/picture">
+                <pic:pic>
+                  <pic:nvPicPr>
+                    <pic:cNvPr id="0" name="arch.png"/>
+                    <pic:cNvPicPr/>
+                  </pic:nvPicPr>
+                  <pic:blipFill>
+                    <a:blip r:embed="rId10"/>
+                    <a:stretch>
+                      <a:fillRect/>
+                    </a:stretch>
+                  </pic:blipFill>
+                  <pic:spPr>
+                    <a:xfrm>
+                      <a:off x="0" y="0"/>
+                      <a:ext cx="5486400" cy="2982540"/>
+                    </a:xfrm>
+                    <a:prstGeom prst="rect"/>
+                  </pic:spPr>
+                </pic:pic>
+              </a:graphicData>
+            </a:graphic>
+          </wp:inline>
+        </w:drawing>
+      </w:r>
+    </w:p>
+    <w:p>
+      <w:pPr>
+        <w:spacing w:after="200"/>
         <w:jc w:val="center"/>
       </w:pPr>
       <w:r>
@@ -7359,7 +7421,7 @@
           <w:color w:val="7F7F7F"/>
           <w:sz w:val="18"/>
         </w:rPr>
-        <w:t>Figure: System Architecture Diagram – 3-Tier Web Application</w:t>
+        <w:t>Figure: Figure 5.1 – System Architecture Diagram (3-Tier Web Application)</w:t>
       </w:r>
     </w:p>
     <w:p>
@@ -7389,43 +7451,49 @@
         <w:t>The use case diagram below shows interactions between the two primary actors (Customer and Administrator) and the system's core use cases.</w:t>
       </w:r>
     </w:p>
-    <w:tbl>
-      <w:tblPr>
-        <w:tblStyle w:val="TableGrid"/>
-        <w:tblW w:type="auto" w:w="0"/>
-        <w:tblLook w:firstColumn="1" w:firstRow="1" w:lastColumn="0" w:lastRow="0" w:noHBand="0" w:noVBand="1" w:val="04A0"/>
-      </w:tblPr>
-      <w:tblGrid>
-        <w:gridCol w:w="9072"/>
-      </w:tblGrid>
-      <w:tr>
-        <w:tc>
-          <w:tcPr>
-            <w:tcW w:type="dxa" w:w="9072"/>
-            <w:shd w:val="clear" w:color="auto" w:fill="E8E8E8"/>
-          </w:tcPr>
-          <w:p>
-            <w:pPr>
-              <w:spacing w:before="800" w:after="800"/>
-              <w:jc w:val="center"/>
-            </w:pPr>
-            <w:r>
-              <w:rPr>
-                <w:rFonts w:ascii="Calibri" w:hAnsi="Calibri"/>
-                <w:b w:val="0"/>
-                <w:i/>
-                <w:color w:val="595959"/>
-                <w:sz w:val="22"/>
-              </w:rPr>
-              <w:t>[ Screenshot: Use Case Diagram – Restaurant Management System ]</w:t>
-            </w:r>
-          </w:p>
-        </w:tc>
-      </w:tr>
-    </w:tbl>
     <w:p>
       <w:pPr>
-        <w:spacing w:after="160"/>
+        <w:spacing w:before="80" w:after="40"/>
+        <w:jc w:val="center"/>
+      </w:pPr>
+      <w:r>
+        <w:drawing>
+          <wp:inline xmlns:a="http://schemas.openxmlformats.org/drawingml/2006/main" xmlns:pic="http://schemas.openxmlformats.org/drawingml/2006/picture">
+            <wp:extent cx="5486400" cy="3796204"/>
+            <wp:docPr id="3" name="Picture 3"/>
+            <wp:cNvGraphicFramePr>
+              <a:graphicFrameLocks noChangeAspect="1"/>
+            </wp:cNvGraphicFramePr>
+            <a:graphic>
+              <a:graphicData uri="http://schemas.openxmlformats.org/drawingml/2006/picture">
+                <pic:pic>
+                  <pic:nvPicPr>
+                    <pic:cNvPr id="0" name="usecase.png"/>
+                    <pic:cNvPicPr/>
+                  </pic:nvPicPr>
+                  <pic:blipFill>
+                    <a:blip r:embed="rId11"/>
+                    <a:stretch>
+                      <a:fillRect/>
+                    </a:stretch>
+                  </pic:blipFill>
+                  <pic:spPr>
+                    <a:xfrm>
+                      <a:off x="0" y="0"/>
+                      <a:ext cx="5486400" cy="3796204"/>
+                    </a:xfrm>
+                    <a:prstGeom prst="rect"/>
+                  </pic:spPr>
+                </pic:pic>
+              </a:graphicData>
+            </a:graphic>
+          </wp:inline>
+        </w:drawing>
+      </w:r>
+    </w:p>
+    <w:p>
+      <w:pPr>
+        <w:spacing w:after="200"/>
         <w:jc w:val="center"/>
       </w:pPr>
       <w:r>
@@ -7436,7 +7504,12 @@
           <w:color w:val="7F7F7F"/>
           <w:sz w:val="18"/>
         </w:rPr>
-        <w:t>Figure: Use Case Diagram – Restaurant Management System</w:t>
+        <w:t>Figure: Figure 5.2 – Use Case Diagram – Restaurant Management System</w:t>
+      </w:r>
+    </w:p>
+    <w:p>
+      <w:r>
+        <w:br w:type="page"/>
       </w:r>
     </w:p>
     <w:p>
@@ -7466,43 +7539,49 @@
         <w:t>The ER diagram illustrates relationships between entities: User, Category, Menu, Order, OrderItem, Table, and Reservation.</w:t>
       </w:r>
     </w:p>
-    <w:tbl>
-      <w:tblPr>
-        <w:tblStyle w:val="TableGrid"/>
-        <w:tblW w:type="auto" w:w="0"/>
-        <w:tblLook w:firstColumn="1" w:firstRow="1" w:lastColumn="0" w:lastRow="0" w:noHBand="0" w:noVBand="1" w:val="04A0"/>
-      </w:tblPr>
-      <w:tblGrid>
-        <w:gridCol w:w="9072"/>
-      </w:tblGrid>
-      <w:tr>
-        <w:tc>
-          <w:tcPr>
-            <w:tcW w:type="dxa" w:w="9072"/>
-            <w:shd w:val="clear" w:color="auto" w:fill="E8E8E8"/>
-          </w:tcPr>
-          <w:p>
-            <w:pPr>
-              <w:spacing w:before="800" w:after="800"/>
-              <w:jc w:val="center"/>
-            </w:pPr>
-            <w:r>
-              <w:rPr>
-                <w:rFonts w:ascii="Calibri" w:hAnsi="Calibri"/>
-                <w:b w:val="0"/>
-                <w:i/>
-                <w:color w:val="595959"/>
-                <w:sz w:val="22"/>
-              </w:rPr>
-              <w:t>[ Screenshot: Entity-Relationship (ER) Diagram – restaurant_db ]</w:t>
-            </w:r>
-          </w:p>
-        </w:tc>
-      </w:tr>
-    </w:tbl>
     <w:p>
       <w:pPr>
-        <w:spacing w:after="160"/>
+        <w:spacing w:before="80" w:after="40"/>
+        <w:jc w:val="center"/>
+      </w:pPr>
+      <w:r>
+        <w:drawing>
+          <wp:inline xmlns:a="http://schemas.openxmlformats.org/drawingml/2006/main" xmlns:pic="http://schemas.openxmlformats.org/drawingml/2006/picture">
+            <wp:extent cx="5669280" cy="3770396"/>
+            <wp:docPr id="4" name="Picture 4"/>
+            <wp:cNvGraphicFramePr>
+              <a:graphicFrameLocks noChangeAspect="1"/>
+            </wp:cNvGraphicFramePr>
+            <a:graphic>
+              <a:graphicData uri="http://schemas.openxmlformats.org/drawingml/2006/picture">
+                <pic:pic>
+                  <pic:nvPicPr>
+                    <pic:cNvPr id="0" name="er.png"/>
+                    <pic:cNvPicPr/>
+                  </pic:nvPicPr>
+                  <pic:blipFill>
+                    <a:blip r:embed="rId12"/>
+                    <a:stretch>
+                      <a:fillRect/>
+                    </a:stretch>
+                  </pic:blipFill>
+                  <pic:spPr>
+                    <a:xfrm>
+                      <a:off x="0" y="0"/>
+                      <a:ext cx="5669280" cy="3770396"/>
+                    </a:xfrm>
+                    <a:prstGeom prst="rect"/>
+                  </pic:spPr>
+                </pic:pic>
+              </a:graphicData>
+            </a:graphic>
+          </wp:inline>
+        </w:drawing>
+      </w:r>
+    </w:p>
+    <w:p>
+      <w:pPr>
+        <w:spacing w:after="200"/>
         <w:jc w:val="center"/>
       </w:pPr>
       <w:r>
@@ -7513,7 +7592,7 @@
           <w:color w:val="7F7F7F"/>
           <w:sz w:val="18"/>
         </w:rPr>
-        <w:t>Figure: Entity-Relationship (ER) Diagram – restaurant_db</w:t>
+        <w:t>Figure: Figure 5.3 – Entity-Relationship (ER) Diagram – restaurant_db</w:t>
       </w:r>
     </w:p>
     <w:p>
@@ -7543,43 +7622,49 @@
         <w:t>The Level 0 DFD (Context Diagram) shows the system as a single process with inputs from Customer and Admin, and outputs including order confirmations, reports, and status updates.</w:t>
       </w:r>
     </w:p>
-    <w:tbl>
-      <w:tblPr>
-        <w:tblStyle w:val="TableGrid"/>
-        <w:tblW w:type="auto" w:w="0"/>
-        <w:tblLook w:firstColumn="1" w:firstRow="1" w:lastColumn="0" w:lastRow="0" w:noHBand="0" w:noVBand="1" w:val="04A0"/>
-      </w:tblPr>
-      <w:tblGrid>
-        <w:gridCol w:w="9072"/>
-      </w:tblGrid>
-      <w:tr>
-        <w:tc>
-          <w:tcPr>
-            <w:tcW w:type="dxa" w:w="9072"/>
-            <w:shd w:val="clear" w:color="auto" w:fill="E8E8E8"/>
-          </w:tcPr>
-          <w:p>
-            <w:pPr>
-              <w:spacing w:before="800" w:after="800"/>
-              <w:jc w:val="center"/>
-            </w:pPr>
-            <w:r>
-              <w:rPr>
-                <w:rFonts w:ascii="Calibri" w:hAnsi="Calibri"/>
-                <w:b w:val="0"/>
-                <w:i/>
-                <w:color w:val="595959"/>
-                <w:sz w:val="22"/>
-              </w:rPr>
-              <w:t>[ Screenshot: Data Flow Diagram – Level 0 (Context Diagram) ]</w:t>
-            </w:r>
-          </w:p>
-        </w:tc>
-      </w:tr>
-    </w:tbl>
     <w:p>
       <w:pPr>
-        <w:spacing w:after="160"/>
+        <w:spacing w:before="80" w:after="40"/>
+        <w:jc w:val="center"/>
+      </w:pPr>
+      <w:r>
+        <w:drawing>
+          <wp:inline xmlns:a="http://schemas.openxmlformats.org/drawingml/2006/main" xmlns:pic="http://schemas.openxmlformats.org/drawingml/2006/picture">
+            <wp:extent cx="5486400" cy="3475027"/>
+            <wp:docPr id="5" name="Picture 5"/>
+            <wp:cNvGraphicFramePr>
+              <a:graphicFrameLocks noChangeAspect="1"/>
+            </wp:cNvGraphicFramePr>
+            <a:graphic>
+              <a:graphicData uri="http://schemas.openxmlformats.org/drawingml/2006/picture">
+                <pic:pic>
+                  <pic:nvPicPr>
+                    <pic:cNvPr id="0" name="dfd.png"/>
+                    <pic:cNvPicPr/>
+                  </pic:nvPicPr>
+                  <pic:blipFill>
+                    <a:blip r:embed="rId13"/>
+                    <a:stretch>
+                      <a:fillRect/>
+                    </a:stretch>
+                  </pic:blipFill>
+                  <pic:spPr>
+                    <a:xfrm>
+                      <a:off x="0" y="0"/>
+                      <a:ext cx="5486400" cy="3475027"/>
+                    </a:xfrm>
+                    <a:prstGeom prst="rect"/>
+                  </pic:spPr>
+                </pic:pic>
+              </a:graphicData>
+            </a:graphic>
+          </wp:inline>
+        </w:drawing>
+      </w:r>
+    </w:p>
+    <w:p>
+      <w:pPr>
+        <w:spacing w:after="200"/>
         <w:jc w:val="center"/>
       </w:pPr>
       <w:r>
@@ -7590,7 +7675,7 @@
           <w:color w:val="7F7F7F"/>
           <w:sz w:val="18"/>
         </w:rPr>
-        <w:t>Figure: Data Flow Diagram – Level 0 (Context Diagram)</w:t>
+        <w:t>Figure: Figure 5.4 – Data Flow Diagram – Level 0 (Context Diagram)</w:t>
       </w:r>
     </w:p>
     <w:p>
@@ -9239,7 +9324,7 @@
                 <w:i w:val="0"/>
                 <w:sz w:val="20"/>
               </w:rPr>
-              <w:t>FK → categories(id)</w:t>
+              <w:t>FK -&gt; categories(id)</w:t>
             </w:r>
           </w:p>
         </w:tc>
@@ -9938,7 +10023,7 @@
                 <w:i w:val="0"/>
                 <w:sz w:val="20"/>
               </w:rPr>
-              <w:t>FK → users(id)</w:t>
+              <w:t>FK -&gt; users(id)</w:t>
             </w:r>
           </w:p>
         </w:tc>
@@ -10637,7 +10722,7 @@
                 <w:i w:val="0"/>
                 <w:sz w:val="20"/>
               </w:rPr>
-              <w:t>FK → orders(id)</w:t>
+              <w:t>FK -&gt; orders(id)</w:t>
             </w:r>
           </w:p>
         </w:tc>
@@ -10703,7 +10788,7 @@
                 <w:i w:val="0"/>
                 <w:sz w:val="20"/>
               </w:rPr>
-              <w:t>FK → menus(id)</w:t>
+              <w:t>FK -&gt; menus(id)</w:t>
             </w:r>
           </w:p>
         </w:tc>
@@ -10917,7 +11002,7 @@
                 <w:i w:val="0"/>
                 <w:sz w:val="20"/>
               </w:rPr>
-              <w:t>quantity × unit_price</w:t>
+              <w:t>quantity x unit_price</w:t>
             </w:r>
           </w:p>
         </w:tc>
@@ -11705,7 +11790,7 @@
                 <w:i w:val="0"/>
                 <w:sz w:val="20"/>
               </w:rPr>
-              <w:t>FK → users(id)</w:t>
+              <w:t>FK -&gt; users(id)</w:t>
             </w:r>
           </w:p>
         </w:tc>
@@ -11771,7 +11856,7 @@
                 <w:i w:val="0"/>
                 <w:sz w:val="20"/>
               </w:rPr>
-              <w:t>FK → tables(id)</w:t>
+              <w:t>FK -&gt; tables(id)</w:t>
             </w:r>
           </w:p>
         </w:tc>
@@ -12697,7 +12782,7 @@
           <w:i w:val="0"/>
           <w:sz w:val="22"/>
         </w:rPr>
-        <w:t>The following screenshots demonstrate the key pages of the Restaurant Management System. Insert actual screenshots in place of the grey placeholders.</w:t>
+        <w:t>The following screenshots illustrate the key pages of the Restaurant Management System web application.</w:t>
       </w:r>
     </w:p>
     <w:p>
@@ -12713,43 +12798,63 @@
         <w:t>8.1 Home / Landing Page</w:t>
       </w:r>
     </w:p>
-    <w:tbl>
-      <w:tblPr>
-        <w:tblStyle w:val="TableGrid"/>
-        <w:tblW w:type="auto" w:w="0"/>
-        <w:tblLook w:firstColumn="1" w:firstRow="1" w:lastColumn="0" w:lastRow="0" w:noHBand="0" w:noVBand="1" w:val="04A0"/>
-      </w:tblPr>
-      <w:tblGrid>
-        <w:gridCol w:w="9072"/>
-      </w:tblGrid>
-      <w:tr>
-        <w:tc>
-          <w:tcPr>
-            <w:tcW w:type="dxa" w:w="9072"/>
-            <w:shd w:val="clear" w:color="auto" w:fill="E8E8E8"/>
-          </w:tcPr>
-          <w:p>
-            <w:pPr>
-              <w:spacing w:before="800" w:after="800"/>
-              <w:jc w:val="center"/>
-            </w:pPr>
-            <w:r>
-              <w:rPr>
-                <w:rFonts w:ascii="Calibri" w:hAnsi="Calibri"/>
-                <w:b w:val="0"/>
-                <w:i/>
-                <w:color w:val="595959"/>
-                <w:sz w:val="22"/>
-              </w:rPr>
-              <w:t>[ Screenshot: Home Page – Hero Banner, Featured Dishes, and Call-to-Action Buttons ]</w:t>
-            </w:r>
-          </w:p>
-        </w:tc>
-      </w:tr>
-    </w:tbl>
     <w:p>
       <w:pPr>
-        <w:spacing w:after="160"/>
+        <w:spacing w:after="120"/>
+      </w:pPr>
+      <w:r>
+        <w:rPr>
+          <w:rFonts w:ascii="Calibri" w:hAnsi="Calibri"/>
+          <w:b w:val="0"/>
+          <w:i w:val="0"/>
+          <w:sz w:val="22"/>
+        </w:rPr>
+        <w:t>The home page features a hero banner with call-to-action buttons, featured food cards, and a navigation bar.</w:t>
+      </w:r>
+    </w:p>
+    <w:p>
+      <w:pPr>
+        <w:spacing w:before="80" w:after="40"/>
+        <w:jc w:val="center"/>
+      </w:pPr>
+      <w:r>
+        <w:drawing>
+          <wp:inline xmlns:a="http://schemas.openxmlformats.org/drawingml/2006/main" xmlns:pic="http://schemas.openxmlformats.org/drawingml/2006/picture">
+            <wp:extent cx="5669280" cy="3543300"/>
+            <wp:docPr id="6" name="Picture 6"/>
+            <wp:cNvGraphicFramePr>
+              <a:graphicFrameLocks noChangeAspect="1"/>
+            </wp:cNvGraphicFramePr>
+            <a:graphic>
+              <a:graphicData uri="http://schemas.openxmlformats.org/drawingml/2006/picture">
+                <pic:pic>
+                  <pic:nvPicPr>
+                    <pic:cNvPr id="0" name="home.png"/>
+                    <pic:cNvPicPr/>
+                  </pic:nvPicPr>
+                  <pic:blipFill>
+                    <a:blip r:embed="rId14"/>
+                    <a:stretch>
+                      <a:fillRect/>
+                    </a:stretch>
+                  </pic:blipFill>
+                  <pic:spPr>
+                    <a:xfrm>
+                      <a:off x="0" y="0"/>
+                      <a:ext cx="5669280" cy="3543300"/>
+                    </a:xfrm>
+                    <a:prstGeom prst="rect"/>
+                  </pic:spPr>
+                </pic:pic>
+              </a:graphicData>
+            </a:graphic>
+          </wp:inline>
+        </w:drawing>
+      </w:r>
+    </w:p>
+    <w:p>
+      <w:pPr>
+        <w:spacing w:after="200"/>
         <w:jc w:val="center"/>
       </w:pPr>
       <w:r>
@@ -12760,7 +12865,12 @@
           <w:color w:val="7F7F7F"/>
           <w:sz w:val="18"/>
         </w:rPr>
-        <w:t>Figure: Home Page – Hero Banner, Featured Dishes, and Call-to-Action Buttons</w:t>
+        <w:t>Figure: Figure 8.1 – Home / Landing Page</w:t>
+      </w:r>
+    </w:p>
+    <w:p>
+      <w:r>
+        <w:br w:type="page"/>
       </w:r>
     </w:p>
     <w:p>
@@ -12776,43 +12886,63 @@
         <w:t>8.2 User Registration Page</w:t>
       </w:r>
     </w:p>
-    <w:tbl>
-      <w:tblPr>
-        <w:tblStyle w:val="TableGrid"/>
-        <w:tblW w:type="auto" w:w="0"/>
-        <w:tblLook w:firstColumn="1" w:firstRow="1" w:lastColumn="0" w:lastRow="0" w:noHBand="0" w:noVBand="1" w:val="04A0"/>
-      </w:tblPr>
-      <w:tblGrid>
-        <w:gridCol w:w="9072"/>
-      </w:tblGrid>
-      <w:tr>
-        <w:tc>
-          <w:tcPr>
-            <w:tcW w:type="dxa" w:w="9072"/>
-            <w:shd w:val="clear" w:color="auto" w:fill="E8E8E8"/>
-          </w:tcPr>
-          <w:p>
-            <w:pPr>
-              <w:spacing w:before="800" w:after="800"/>
-              <w:jc w:val="center"/>
-            </w:pPr>
-            <w:r>
-              <w:rPr>
-                <w:rFonts w:ascii="Calibri" w:hAnsi="Calibri"/>
-                <w:b w:val="0"/>
-                <w:i/>
-                <w:color w:val="595959"/>
-                <w:sz w:val="22"/>
-              </w:rPr>
-              <w:t>[ Screenshot: Registration Form – Name, Email, Password Fields, and Submit Button ]</w:t>
-            </w:r>
-          </w:p>
-        </w:tc>
-      </w:tr>
-    </w:tbl>
     <w:p>
       <w:pPr>
-        <w:spacing w:after="160"/>
+        <w:spacing w:after="120"/>
+      </w:pPr>
+      <w:r>
+        <w:rPr>
+          <w:rFonts w:ascii="Calibri" w:hAnsi="Calibri"/>
+          <w:b w:val="0"/>
+          <w:i w:val="0"/>
+          <w:sz w:val="22"/>
+        </w:rPr>
+        <w:t>New users can register by providing their full name, email, phone number, and a secure password.</w:t>
+      </w:r>
+    </w:p>
+    <w:p>
+      <w:pPr>
+        <w:spacing w:before="80" w:after="40"/>
+        <w:jc w:val="center"/>
+      </w:pPr>
+      <w:r>
+        <w:drawing>
+          <wp:inline xmlns:a="http://schemas.openxmlformats.org/drawingml/2006/main" xmlns:pic="http://schemas.openxmlformats.org/drawingml/2006/picture">
+            <wp:extent cx="5486400" cy="3429000"/>
+            <wp:docPr id="7" name="Picture 7"/>
+            <wp:cNvGraphicFramePr>
+              <a:graphicFrameLocks noChangeAspect="1"/>
+            </wp:cNvGraphicFramePr>
+            <a:graphic>
+              <a:graphicData uri="http://schemas.openxmlformats.org/drawingml/2006/picture">
+                <pic:pic>
+                  <pic:nvPicPr>
+                    <pic:cNvPr id="0" name="register.png"/>
+                    <pic:cNvPicPr/>
+                  </pic:nvPicPr>
+                  <pic:blipFill>
+                    <a:blip r:embed="rId15"/>
+                    <a:stretch>
+                      <a:fillRect/>
+                    </a:stretch>
+                  </pic:blipFill>
+                  <pic:spPr>
+                    <a:xfrm>
+                      <a:off x="0" y="0"/>
+                      <a:ext cx="5486400" cy="3429000"/>
+                    </a:xfrm>
+                    <a:prstGeom prst="rect"/>
+                  </pic:spPr>
+                </pic:pic>
+              </a:graphicData>
+            </a:graphic>
+          </wp:inline>
+        </w:drawing>
+      </w:r>
+    </w:p>
+    <w:p>
+      <w:pPr>
+        <w:spacing w:after="200"/>
         <w:jc w:val="center"/>
       </w:pPr>
       <w:r>
@@ -12823,7 +12953,7 @@
           <w:color w:val="7F7F7F"/>
           <w:sz w:val="18"/>
         </w:rPr>
-        <w:t>Figure: Registration Form – Name, Email, Password Fields, and Submit Button</w:t>
+        <w:t>Figure: Figure 8.2 – User Registration Page</w:t>
       </w:r>
     </w:p>
     <w:p>
@@ -12839,43 +12969,63 @@
         <w:t>8.3 Login Page</w:t>
       </w:r>
     </w:p>
-    <w:tbl>
-      <w:tblPr>
-        <w:tblStyle w:val="TableGrid"/>
-        <w:tblW w:type="auto" w:w="0"/>
-        <w:tblLook w:firstColumn="1" w:firstRow="1" w:lastColumn="0" w:lastRow="0" w:noHBand="0" w:noVBand="1" w:val="04A0"/>
-      </w:tblPr>
-      <w:tblGrid>
-        <w:gridCol w:w="9072"/>
-      </w:tblGrid>
-      <w:tr>
-        <w:tc>
-          <w:tcPr>
-            <w:tcW w:type="dxa" w:w="9072"/>
-            <w:shd w:val="clear" w:color="auto" w:fill="E8E8E8"/>
-          </w:tcPr>
-          <w:p>
-            <w:pPr>
-              <w:spacing w:before="800" w:after="800"/>
-              <w:jc w:val="center"/>
-            </w:pPr>
-            <w:r>
-              <w:rPr>
-                <w:rFonts w:ascii="Calibri" w:hAnsi="Calibri"/>
-                <w:b w:val="0"/>
-                <w:i/>
-                <w:color w:val="595959"/>
-                <w:sz w:val="22"/>
-              </w:rPr>
-              <w:t>[ Screenshot: Login Page – Email, Password, Remember Me Checkbox ]</w:t>
-            </w:r>
-          </w:p>
-        </w:tc>
-      </w:tr>
-    </w:tbl>
     <w:p>
       <w:pPr>
-        <w:spacing w:after="160"/>
+        <w:spacing w:after="120"/>
+      </w:pPr>
+      <w:r>
+        <w:rPr>
+          <w:rFonts w:ascii="Calibri" w:hAnsi="Calibri"/>
+          <w:b w:val="0"/>
+          <w:i w:val="0"/>
+          <w:sz w:val="22"/>
+        </w:rPr>
+        <w:t>The login page uses a split-screen layout — highlighting system benefits on the left and the login form on the right.</w:t>
+      </w:r>
+    </w:p>
+    <w:p>
+      <w:pPr>
+        <w:spacing w:before="80" w:after="40"/>
+        <w:jc w:val="center"/>
+      </w:pPr>
+      <w:r>
+        <w:drawing>
+          <wp:inline xmlns:a="http://schemas.openxmlformats.org/drawingml/2006/main" xmlns:pic="http://schemas.openxmlformats.org/drawingml/2006/picture">
+            <wp:extent cx="5486400" cy="3429000"/>
+            <wp:docPr id="8" name="Picture 8"/>
+            <wp:cNvGraphicFramePr>
+              <a:graphicFrameLocks noChangeAspect="1"/>
+            </wp:cNvGraphicFramePr>
+            <a:graphic>
+              <a:graphicData uri="http://schemas.openxmlformats.org/drawingml/2006/picture">
+                <pic:pic>
+                  <pic:nvPicPr>
+                    <pic:cNvPr id="0" name="login.png"/>
+                    <pic:cNvPicPr/>
+                  </pic:nvPicPr>
+                  <pic:blipFill>
+                    <a:blip r:embed="rId16"/>
+                    <a:stretch>
+                      <a:fillRect/>
+                    </a:stretch>
+                  </pic:blipFill>
+                  <pic:spPr>
+                    <a:xfrm>
+                      <a:off x="0" y="0"/>
+                      <a:ext cx="5486400" cy="3429000"/>
+                    </a:xfrm>
+                    <a:prstGeom prst="rect"/>
+                  </pic:spPr>
+                </pic:pic>
+              </a:graphicData>
+            </a:graphic>
+          </wp:inline>
+        </w:drawing>
+      </w:r>
+    </w:p>
+    <w:p>
+      <w:pPr>
+        <w:spacing w:after="200"/>
         <w:jc w:val="center"/>
       </w:pPr>
       <w:r>
@@ -12886,7 +13036,7 @@
           <w:color w:val="7F7F7F"/>
           <w:sz w:val="18"/>
         </w:rPr>
-        <w:t>Figure: Login Page – Email, Password, Remember Me Checkbox</w:t>
+        <w:t>Figure: Figure 8.3 – Login Page</w:t>
       </w:r>
     </w:p>
     <w:p>
@@ -12907,43 +13057,63 @@
         <w:t>8.4 Menu Listing Page</w:t>
       </w:r>
     </w:p>
-    <w:tbl>
-      <w:tblPr>
-        <w:tblStyle w:val="TableGrid"/>
-        <w:tblW w:type="auto" w:w="0"/>
-        <w:tblLook w:firstColumn="1" w:firstRow="1" w:lastColumn="0" w:lastRow="0" w:noHBand="0" w:noVBand="1" w:val="04A0"/>
-      </w:tblPr>
-      <w:tblGrid>
-        <w:gridCol w:w="9072"/>
-      </w:tblGrid>
-      <w:tr>
-        <w:tc>
-          <w:tcPr>
-            <w:tcW w:type="dxa" w:w="9072"/>
-            <w:shd w:val="clear" w:color="auto" w:fill="E8E8E8"/>
-          </w:tcPr>
-          <w:p>
-            <w:pPr>
-              <w:spacing w:before="800" w:after="800"/>
-              <w:jc w:val="center"/>
-            </w:pPr>
-            <w:r>
-              <w:rPr>
-                <w:rFonts w:ascii="Calibri" w:hAnsi="Calibri"/>
-                <w:b w:val="0"/>
-                <w:i/>
-                <w:color w:val="595959"/>
-                <w:sz w:val="22"/>
-              </w:rPr>
-              <w:t>[ Screenshot: Menu Listing – Food Category Cards with Images and View Buttons ]</w:t>
-            </w:r>
-          </w:p>
-        </w:tc>
-      </w:tr>
-    </w:tbl>
     <w:p>
       <w:pPr>
-        <w:spacing w:after="160"/>
+        <w:spacing w:after="120"/>
+      </w:pPr>
+      <w:r>
+        <w:rPr>
+          <w:rFonts w:ascii="Calibri" w:hAnsi="Calibri"/>
+          <w:b w:val="0"/>
+          <w:i w:val="0"/>
+          <w:sz w:val="22"/>
+        </w:rPr>
+        <w:t>The menu page displays food items grouped by category with search functionality, filter tabs, ratings, prices, and an Add to Cart button.</w:t>
+      </w:r>
+    </w:p>
+    <w:p>
+      <w:pPr>
+        <w:spacing w:before="80" w:after="40"/>
+        <w:jc w:val="center"/>
+      </w:pPr>
+      <w:r>
+        <w:drawing>
+          <wp:inline xmlns:a="http://schemas.openxmlformats.org/drawingml/2006/main" xmlns:pic="http://schemas.openxmlformats.org/drawingml/2006/picture">
+            <wp:extent cx="5669280" cy="3543300"/>
+            <wp:docPr id="9" name="Picture 9"/>
+            <wp:cNvGraphicFramePr>
+              <a:graphicFrameLocks noChangeAspect="1"/>
+            </wp:cNvGraphicFramePr>
+            <a:graphic>
+              <a:graphicData uri="http://schemas.openxmlformats.org/drawingml/2006/picture">
+                <pic:pic>
+                  <pic:nvPicPr>
+                    <pic:cNvPr id="0" name="menu.png"/>
+                    <pic:cNvPicPr/>
+                  </pic:nvPicPr>
+                  <pic:blipFill>
+                    <a:blip r:embed="rId17"/>
+                    <a:stretch>
+                      <a:fillRect/>
+                    </a:stretch>
+                  </pic:blipFill>
+                  <pic:spPr>
+                    <a:xfrm>
+                      <a:off x="0" y="0"/>
+                      <a:ext cx="5669280" cy="3543300"/>
+                    </a:xfrm>
+                    <a:prstGeom prst="rect"/>
+                  </pic:spPr>
+                </pic:pic>
+              </a:graphicData>
+            </a:graphic>
+          </wp:inline>
+        </w:drawing>
+      </w:r>
+    </w:p>
+    <w:p>
+      <w:pPr>
+        <w:spacing w:after="200"/>
         <w:jc w:val="center"/>
       </w:pPr>
       <w:r>
@@ -12954,7 +13124,7 @@
           <w:color w:val="7F7F7F"/>
           <w:sz w:val="18"/>
         </w:rPr>
-        <w:t>Figure: Menu Listing – Food Category Cards with Images and View Buttons</w:t>
+        <w:t>Figure: Figure 8.4 – Menu Listing Page</w:t>
       </w:r>
     </w:p>
     <w:p>
@@ -12970,43 +13140,63 @@
         <w:t>8.5 Shopping Cart Page</w:t>
       </w:r>
     </w:p>
-    <w:tbl>
-      <w:tblPr>
-        <w:tblStyle w:val="TableGrid"/>
-        <w:tblW w:type="auto" w:w="0"/>
-        <w:tblLook w:firstColumn="1" w:firstRow="1" w:lastColumn="0" w:lastRow="0" w:noHBand="0" w:noVBand="1" w:val="04A0"/>
-      </w:tblPr>
-      <w:tblGrid>
-        <w:gridCol w:w="9072"/>
-      </w:tblGrid>
-      <w:tr>
-        <w:tc>
-          <w:tcPr>
-            <w:tcW w:type="dxa" w:w="9072"/>
-            <w:shd w:val="clear" w:color="auto" w:fill="E8E8E8"/>
-          </w:tcPr>
-          <w:p>
-            <w:pPr>
-              <w:spacing w:before="800" w:after="800"/>
-              <w:jc w:val="center"/>
-            </w:pPr>
-            <w:r>
-              <w:rPr>
-                <w:rFonts w:ascii="Calibri" w:hAnsi="Calibri"/>
-                <w:b w:val="0"/>
-                <w:i/>
-                <w:color w:val="595959"/>
-                <w:sz w:val="22"/>
-              </w:rPr>
-              <w:t>[ Screenshot: Cart Page – Item List, Quantity Controls, Subtotals, and Place Order Button ]</w:t>
-            </w:r>
-          </w:p>
-        </w:tc>
-      </w:tr>
-    </w:tbl>
     <w:p>
       <w:pPr>
-        <w:spacing w:after="160"/>
+        <w:spacing w:after="120"/>
+      </w:pPr>
+      <w:r>
+        <w:rPr>
+          <w:rFonts w:ascii="Calibri" w:hAnsi="Calibri"/>
+          <w:b w:val="0"/>
+          <w:i w:val="0"/>
+          <w:sz w:val="22"/>
+        </w:rPr>
+        <w:t>The cart page shows selected items with quantity controls, subtotals, a coupon code field, payment method selection, and a Place Order button.</w:t>
+      </w:r>
+    </w:p>
+    <w:p>
+      <w:pPr>
+        <w:spacing w:before="80" w:after="40"/>
+        <w:jc w:val="center"/>
+      </w:pPr>
+      <w:r>
+        <w:drawing>
+          <wp:inline xmlns:a="http://schemas.openxmlformats.org/drawingml/2006/main" xmlns:pic="http://schemas.openxmlformats.org/drawingml/2006/picture">
+            <wp:extent cx="5669280" cy="3543300"/>
+            <wp:docPr id="10" name="Picture 10"/>
+            <wp:cNvGraphicFramePr>
+              <a:graphicFrameLocks noChangeAspect="1"/>
+            </wp:cNvGraphicFramePr>
+            <a:graphic>
+              <a:graphicData uri="http://schemas.openxmlformats.org/drawingml/2006/picture">
+                <pic:pic>
+                  <pic:nvPicPr>
+                    <pic:cNvPr id="0" name="cart.png"/>
+                    <pic:cNvPicPr/>
+                  </pic:nvPicPr>
+                  <pic:blipFill>
+                    <a:blip r:embed="rId18"/>
+                    <a:stretch>
+                      <a:fillRect/>
+                    </a:stretch>
+                  </pic:blipFill>
+                  <pic:spPr>
+                    <a:xfrm>
+                      <a:off x="0" y="0"/>
+                      <a:ext cx="5669280" cy="3543300"/>
+                    </a:xfrm>
+                    <a:prstGeom prst="rect"/>
+                  </pic:spPr>
+                </pic:pic>
+              </a:graphicData>
+            </a:graphic>
+          </wp:inline>
+        </w:drawing>
+      </w:r>
+    </w:p>
+    <w:p>
+      <w:pPr>
+        <w:spacing w:after="200"/>
         <w:jc w:val="center"/>
       </w:pPr>
       <w:r>
@@ -13017,7 +13207,12 @@
           <w:color w:val="7F7F7F"/>
           <w:sz w:val="18"/>
         </w:rPr>
-        <w:t>Figure: Cart Page – Item List, Quantity Controls, Subtotals, and Place Order Button</w:t>
+        <w:t>Figure: Figure 8.5 – Shopping Cart Page</w:t>
+      </w:r>
+    </w:p>
+    <w:p>
+      <w:r>
+        <w:br w:type="page"/>
       </w:r>
     </w:p>
     <w:p>
@@ -13033,43 +13228,63 @@
         <w:t>8.6 Admin Dashboard</w:t>
       </w:r>
     </w:p>
-    <w:tbl>
-      <w:tblPr>
-        <w:tblStyle w:val="TableGrid"/>
-        <w:tblW w:type="auto" w:w="0"/>
-        <w:tblLook w:firstColumn="1" w:firstRow="1" w:lastColumn="0" w:lastRow="0" w:noHBand="0" w:noVBand="1" w:val="04A0"/>
-      </w:tblPr>
-      <w:tblGrid>
-        <w:gridCol w:w="9072"/>
-      </w:tblGrid>
-      <w:tr>
-        <w:tc>
-          <w:tcPr>
-            <w:tcW w:type="dxa" w:w="9072"/>
-            <w:shd w:val="clear" w:color="auto" w:fill="E8E8E8"/>
-          </w:tcPr>
-          <w:p>
-            <w:pPr>
-              <w:spacing w:before="800" w:after="800"/>
-              <w:jc w:val="center"/>
-            </w:pPr>
-            <w:r>
-              <w:rPr>
-                <w:rFonts w:ascii="Calibri" w:hAnsi="Calibri"/>
-                <w:b w:val="0"/>
-                <w:i/>
-                <w:color w:val="595959"/>
-                <w:sz w:val="22"/>
-              </w:rPr>
-              <w:t>[ Screenshot: Admin Dashboard – Stats Cards (Total Orders, Revenue, Users), Recent Orders Table, Charts ]</w:t>
-            </w:r>
-          </w:p>
-        </w:tc>
-      </w:tr>
-    </w:tbl>
     <w:p>
       <w:pPr>
-        <w:spacing w:after="160"/>
+        <w:spacing w:after="120"/>
+      </w:pPr>
+      <w:r>
+        <w:rPr>
+          <w:rFonts w:ascii="Calibri" w:hAnsi="Calibri"/>
+          <w:b w:val="0"/>
+          <w:i w:val="0"/>
+          <w:sz w:val="22"/>
+        </w:rPr>
+        <w:t>The admin dashboard provides an overview of key statistics (orders, revenue, users, reservations), a recent orders table with status management, and a weekly sales bar chart.</w:t>
+      </w:r>
+    </w:p>
+    <w:p>
+      <w:pPr>
+        <w:spacing w:before="80" w:after="40"/>
+        <w:jc w:val="center"/>
+      </w:pPr>
+      <w:r>
+        <w:drawing>
+          <wp:inline xmlns:a="http://schemas.openxmlformats.org/drawingml/2006/main" xmlns:pic="http://schemas.openxmlformats.org/drawingml/2006/picture">
+            <wp:extent cx="5669280" cy="3543300"/>
+            <wp:docPr id="11" name="Picture 11"/>
+            <wp:cNvGraphicFramePr>
+              <a:graphicFrameLocks noChangeAspect="1"/>
+            </wp:cNvGraphicFramePr>
+            <a:graphic>
+              <a:graphicData uri="http://schemas.openxmlformats.org/drawingml/2006/picture">
+                <pic:pic>
+                  <pic:nvPicPr>
+                    <pic:cNvPr id="0" name="admin.png"/>
+                    <pic:cNvPicPr/>
+                  </pic:nvPicPr>
+                  <pic:blipFill>
+                    <a:blip r:embed="rId19"/>
+                    <a:stretch>
+                      <a:fillRect/>
+                    </a:stretch>
+                  </pic:blipFill>
+                  <pic:spPr>
+                    <a:xfrm>
+                      <a:off x="0" y="0"/>
+                      <a:ext cx="5669280" cy="3543300"/>
+                    </a:xfrm>
+                    <a:prstGeom prst="rect"/>
+                  </pic:spPr>
+                </pic:pic>
+              </a:graphicData>
+            </a:graphic>
+          </wp:inline>
+        </w:drawing>
+      </w:r>
+    </w:p>
+    <w:p>
+      <w:pPr>
+        <w:spacing w:after="200"/>
         <w:jc w:val="center"/>
       </w:pPr>
       <w:r>
@@ -13080,7 +13295,7 @@
           <w:color w:val="7F7F7F"/>
           <w:sz w:val="18"/>
         </w:rPr>
-        <w:t>Figure: Admin Dashboard – Stats Cards (Total Orders, Revenue, Users), Recent Orders Table, Charts</w:t>
+        <w:t>Figure: Figure 8.6 – Admin Dashboard</w:t>
       </w:r>
     </w:p>
     <w:p>
@@ -14105,7 +14320,7 @@
                 <w:i w:val="0"/>
                 <w:sz w:val="20"/>
               </w:rPr>
-              <w:t>Order confirmed, email sent</w:t>
+              <w:t>Order confirmed</w:t>
             </w:r>
           </w:p>
         </w:tc>
@@ -15657,49 +15872,37 @@
         <w:br/>
         <w:t>├── app/</w:t>
         <w:br/>
-        <w:t>│   ├── Http/</w:t>
+        <w:t>│   ├── Http/Controllers/</w:t>
         <w:br/>
-        <w:t>│   │   ├── Controllers/</w:t>
+        <w:t>│   │   ├── HomeController.php</w:t>
         <w:br/>
-        <w:t>│   │   │   ├── HomeController.php</w:t>
+        <w:t>│   │   ├── MenuController.php</w:t>
         <w:br/>
-        <w:t>│   │   │   ├── MenuController.php</w:t>
+        <w:t>│   │   ├── CartController.php</w:t>
         <w:br/>
-        <w:t>│   │   │   ├── CartController.php</w:t>
+        <w:t>│   │   ├── OrderController.php</w:t>
         <w:br/>
-        <w:t>│   │   │   ├── OrderController.php</w:t>
+        <w:t>│   │   ├── ReservationController.php</w:t>
         <w:br/>
-        <w:t>│   │   │   ├── ReservationController.php</w:t>
+        <w:t>│   │   └── Admin/</w:t>
         <w:br/>
-        <w:t>│   │   │   └── Admin/</w:t>
+        <w:t>│   │       ├── AdminController.php</w:t>
         <w:br/>
-        <w:t>│   │   │       ├── AdminController.php</w:t>
+        <w:t>│   │       ├── AdminMenuController.php</w:t>
         <w:br/>
-        <w:t>│   │   │       ├── AdminMenuController.php</w:t>
+        <w:t>│   │       ├── AdminOrderController.php</w:t>
         <w:br/>
-        <w:t>│   │   │       ├── AdminOrderController.php</w:t>
+        <w:t>│   │       └── AdminReportController.php</w:t>
         <w:br/>
-        <w:t>│   │   │       └── AdminReportController.php</w:t>
-        <w:br/>
-        <w:t>│   │   └── Middleware/</w:t>
-        <w:br/>
-        <w:t>│   │       └── RoleMiddleware.php</w:t>
+        <w:t>│   ├── Http/Middleware/RoleMiddleware.php</w:t>
         <w:br/>
         <w:t>│   └── Models/</w:t>
         <w:br/>
-        <w:t>│       ├── User.php</w:t>
+        <w:t>│       ├── User.php  |  Category.php  |  Menu.php</w:t>
         <w:br/>
-        <w:t>│       ├── Category.php</w:t>
+        <w:t>│       ├── Order.php  |  OrderItem.php</w:t>
         <w:br/>
-        <w:t>│       ├── Menu.php</w:t>
-        <w:br/>
-        <w:t>│       ├── Order.php</w:t>
-        <w:br/>
-        <w:t>│       ├── OrderItem.php</w:t>
-        <w:br/>
-        <w:t>│       ├── Table.php</w:t>
-        <w:br/>
-        <w:t>│       └── Reservation.php</w:t>
+        <w:t>│       ├── Table.php  |  Reservation.php</w:t>
         <w:br/>
         <w:t>├── database/migrations/</w:t>
         <w:br/>
@@ -15707,17 +15910,9 @@
         <w:br/>
         <w:t>├── resources/views/</w:t>
         <w:br/>
-        <w:t>│   ├── layouts/</w:t>
+        <w:t>│   ├── layouts/  |  auth/  |  menu/</w:t>
         <w:br/>
-        <w:t>│   ├── auth/</w:t>
-        <w:br/>
-        <w:t>│   ├── menu/</w:t>
-        <w:br/>
-        <w:t>│   ├── cart/</w:t>
-        <w:br/>
-        <w:t>│   ├── orders/</w:t>
-        <w:br/>
-        <w:t>│   ├── reservations/</w:t>
+        <w:t>│   ├── cart/  |  orders/  |  reservations/</w:t>
         <w:br/>
         <w:t>│   └── admin/</w:t>
         <w:br/>
@@ -15811,7 +16006,7 @@
           <w:color w:val="4472C4"/>
           <w:sz w:val="24"/>
         </w:rPr>
-        <w:t>Appendix C: Project Timeline – Gantt Chart (Table)</w:t>
+        <w:t>Appendix C: Project Timeline – Gantt Chart</w:t>
       </w:r>
     </w:p>
     <w:tbl>
@@ -16731,71 +16926,8 @@
       </w:tr>
     </w:tbl>
     <w:p/>
-    <w:p>
-      <w:pPr>
-        <w:pStyle w:val="Heading2"/>
-      </w:pPr>
-      <w:r>
-        <w:rPr>
-          <w:rFonts w:ascii="Calibri" w:hAnsi="Calibri"/>
-          <w:color w:val="4472C4"/>
-          <w:sz w:val="24"/>
-        </w:rPr>
-        <w:t>Appendix D: Git Commit History</w:t>
-      </w:r>
-    </w:p>
-    <w:tbl>
-      <w:tblPr>
-        <w:tblStyle w:val="TableGrid"/>
-        <w:tblW w:type="auto" w:w="0"/>
-        <w:tblLook w:firstColumn="1" w:firstRow="1" w:lastColumn="0" w:lastRow="0" w:noHBand="0" w:noVBand="1" w:val="04A0"/>
-      </w:tblPr>
-      <w:tblGrid>
-        <w:gridCol w:w="9072"/>
-      </w:tblGrid>
-      <w:tr>
-        <w:tc>
-          <w:tcPr>
-            <w:tcW w:type="dxa" w:w="9072"/>
-            <w:shd w:val="clear" w:color="auto" w:fill="E8E8E8"/>
-          </w:tcPr>
-          <w:p>
-            <w:pPr>
-              <w:spacing w:before="800" w:after="800"/>
-              <w:jc w:val="center"/>
-            </w:pPr>
-            <w:r>
-              <w:rPr>
-                <w:rFonts w:ascii="Calibri" w:hAnsi="Calibri"/>
-                <w:b w:val="0"/>
-                <w:i/>
-                <w:color w:val="595959"/>
-                <w:sz w:val="22"/>
-              </w:rPr>
-              <w:t>[ Screenshot: Git Commit History Screenshot (GitHub Repository) ]</w:t>
-            </w:r>
-          </w:p>
-        </w:tc>
-      </w:tr>
-    </w:tbl>
-    <w:p>
-      <w:pPr>
-        <w:spacing w:after="160"/>
-        <w:jc w:val="center"/>
-      </w:pPr>
-      <w:r>
-        <w:rPr>
-          <w:rFonts w:ascii="Calibri" w:hAnsi="Calibri"/>
-          <w:b w:val="0"/>
-          <w:i/>
-          <w:color w:val="7F7F7F"/>
-          <w:sz w:val="18"/>
-        </w:rPr>
-        <w:t>Figure: Git Commit History Screenshot (GitHub Repository)</w:t>
-      </w:r>
-    </w:p>
     <w:sectPr>
-      <w:footerReference w:type="default" r:id="rId9"/>
+      <w:footerReference w:type="default" r:id="rId20"/>
       <w:pgSz w:w="11906" w:h="16838"/>
       <w:pgMar w:top="1417" w:right="1417" w:bottom="1417" w:left="1417" w:header="720" w:footer="720" w:gutter="0"/>
       <w:cols w:space="720"/>

</xml_diff>